<commit_message>
feat: publish LegalOS v0.8.0 public candidate
</commit_message>
<xml_diff>
--- a/skills/legal-os-business-communication/assets/templates/业务微信与口头沟通_标准模板.docx
+++ b/skills/legal-os-business-communication/assets/templates/业务微信与口头沟通_标准模板.docx
@@ -30,7 +30,7 @@
           <w:color w:val="555555"/>
           <w:sz w:val="22"/>
         </w:rPr>
-        <w:t>适用于内部业务消息、电话提纲和会议发言准备。</w:t>
+        <w:t>用于内部业务消息、电话提纲和会议发言准备；External 仅复制经核验且获授权的可发送文本。</w:t>
       </w:r>
     </w:p>
     <w:tbl>
@@ -75,7 +75,7 @@
                 <w:color w:val="0B2545"/>
                 <w:sz w:val="20"/>
               </w:rPr>
-              <w:t>模板说明：</w:t>
+              <w:t>工作台说明：本文件仅用于内部准备，不是自动外发稿。先在“对象/渠道”选择 Internal 或 External；External 仅复制已核验并获授权的最小必要文本，Internal 保留完整风险和不同观点。</w:t>
             </w:r>
             <w:r>
               <w:rPr>
@@ -85,7 +85,6 @@
                 <w:color w:val="1F2937"/>
                 <w:sz w:val="20"/>
               </w:rPr>
-              <w:t>这是内部工作模板，不是对外定稿。请先读取文件和附件，核验事实、对象、权限和发送边界；空缺项不得自行猜补。</w:t>
             </w:r>
           </w:p>
         </w:tc>
@@ -236,7 +235,7 @@
                 <w:color w:val="1F2937"/>
                 <w:sz w:val="19"/>
               </w:rPr>
-              <w:t>〔待填〕</w:t>
+              <w:t>〔必填：事项或项目名称〕</w:t>
             </w:r>
           </w:p>
         </w:tc>
@@ -292,7 +291,7 @@
                 <w:color w:val="1F2937"/>
                 <w:sz w:val="19"/>
               </w:rPr>
-              <w:t>〔领导/业务/内部/合作方；微信/电话/会议〕</w:t>
+              <w:t>〔必填：Internal 或 External；对象类型；微信/电话/会议〕</w:t>
             </w:r>
           </w:p>
         </w:tc>
@@ -348,7 +347,7 @@
                 <w:color w:val="1F2937"/>
                 <w:sz w:val="19"/>
               </w:rPr>
-              <w:t>〔同步/催办/请求/解释/决策〕</w:t>
+              <w:t>〔必填：同步/催办/请求/解释/决策〕</w:t>
             </w:r>
           </w:p>
         </w:tc>
@@ -404,7 +403,7 @@
                 <w:color w:val="1F2937"/>
                 <w:sz w:val="19"/>
               </w:rPr>
-              <w:t>〔内部草稿/可转发/需确认〕</w:t>
+              <w:t>〔必填：内部分析/内部草稿/可转发；外部发送须单独确认〕</w:t>
             </w:r>
           </w:p>
         </w:tc>
@@ -420,7 +419,7 @@
         <w:pStyle w:val="Heading1"/>
       </w:pPr>
       <w:r>
-        <w:t>二、事实与缺口</w:t>
+        <w:t>二、事实、来源与缺口</w:t>
       </w:r>
     </w:p>
     <w:tbl>
@@ -555,7 +554,7 @@
                 <w:color w:val="1F2937"/>
                 <w:sz w:val="19"/>
               </w:rPr>
-              <w:t>〔主体、金额、日期、节点、来源〕</w:t>
+              <w:t>〔填写：主体、金额、日期、节点及来源〕</w:t>
             </w:r>
           </w:p>
         </w:tc>
@@ -611,7 +610,7 @@
                 <w:color w:val="1F2937"/>
                 <w:sz w:val="19"/>
               </w:rPr>
-              <w:t>〔不确定内容〕</w:t>
+              <w:t>〔填写：不确定内容及核验动作；Internal保留；External仅在必须说明时按范围表达〕</w:t>
             </w:r>
           </w:p>
         </w:tc>
@@ -640,7 +639,7 @@
                 <w:color w:val="1F2937"/>
                 <w:sz w:val="19"/>
               </w:rPr>
-              <w:t>不得写入</w:t>
+              <w:t>External不得写入</w:t>
             </w:r>
           </w:p>
         </w:tc>
@@ -667,7 +666,7 @@
                 <w:color w:val="1F2937"/>
                 <w:sz w:val="19"/>
               </w:rPr>
-              <w:t>〔内部策略、未核金额、未经授权承诺〕</w:t>
+              <w:t>〔填写：内部策略、未核金额、未提出的对方抗辩或突破路径、谈判底线、备用方案和未经授权承诺〕</w:t>
             </w:r>
           </w:p>
         </w:tc>
@@ -683,7 +682,7 @@
         <w:pStyle w:val="Heading1"/>
       </w:pPr>
       <w:r>
-        <w:t>三、口径草稿</w:t>
+        <w:t>三、口径草稿（按场景取用）</w:t>
       </w:r>
     </w:p>
     <w:p>
@@ -698,13 +697,13 @@
           <w:color w:val="1F2937"/>
           <w:sz w:val="22"/>
         </w:rPr>
-        <w:t>【结论/现状】〔一句话〕</w:t>
+        <w:t>【Internal分析】〔填写：风险、不同观点、证据缺口和建议〕</w:t>
         <w:br/>
-        <w:t>【关键事实】〔最多3项〕</w:t>
+        <w:t>【External可发送文本】〔填写：仅写完成沟通目的所需的已核验事实、结论和动作〕</w:t>
         <w:br/>
-        <w:t>【请求动作】〔谁在何时做什么〕</w:t>
+        <w:t>【请求动作】〔填写：责任人、动作、期限和回复方式〕</w:t>
         <w:br/>
-        <w:t>【留痕】〔回复、附件、确认方式〕</w:t>
+        <w:t>【留痕】〔填写：回复、附件、确认方式〕</w:t>
       </w:r>
     </w:p>
     <w:tbl>
@@ -749,7 +748,7 @@
                 <w:color w:val="0B2545"/>
                 <w:sz w:val="20"/>
               </w:rPr>
-              <w:t>发送前：</w:t>
+              <w:t>发送前：再次确认场景、事实来源、承诺权限、附件版本；External 与 Internal 文本不得混用，涉及正式通知、现行法律、金额或期限冲突、权利影响时转相应路由。</w:t>
             </w:r>
             <w:r>
               <w:rPr>
@@ -759,7 +758,6 @@
                 <w:color w:val="1F2937"/>
                 <w:sz w:val="20"/>
               </w:rPr>
-              <w:t>确认对象、事实来源、承诺权限、附件版本和是否应转 T-06/T-05/T-08/T-10。</w:t>
             </w:r>
           </w:p>
         </w:tc>

</xml_diff>